<commit_message>
Update downloadable CV with repaired portfolio and profile links
</commit_message>
<xml_diff>
--- a/francis-gunadi-cv.docx
+++ b/francis-gunadi-cv.docx
@@ -59,43 +59,47 @@
         </w:rPr>
         <w:t xml:space="preserve"> | </w:t>
       </w:r>
-      <w:r>
-        <w:rPr>
-          <w:color w:val="1155cc"/>
+      <w:hyperlink r:id="rId10">
+        <w:r>
+          <w:rPr>
+            <w:color w:val="1155cc"/>
+            <w:sz w:val="19"/>
+            <w:szCs w:val="19"/>
+            <w:u w:val="single"/>
+            <w:rtl w:val="0"/>
+          </w:rPr>
+          <w:t xml:space="preserve">LinkedIn</w:t>
+        </w:r>
+      </w:hyperlink>
+      <w:r>
+        <w:rPr>
           <w:sz w:val="19"/>
           <w:szCs w:val="19"/>
-          <w:u w:val="single"/>
-          <w:rtl w:val="0"/>
-        </w:rPr>
-        <w:t xml:space="preserve">LinkedIn</w:t>
-      </w:r>
+          <w:rtl w:val="0"/>
+        </w:rPr>
+        <w:t xml:space="preserve"> | </w:t>
+      </w:r>
+      <w:hyperlink r:id="rId11">
+        <w:r>
+          <w:rPr>
+            <w:color w:val="1155cc"/>
+            <w:sz w:val="19"/>
+            <w:szCs w:val="19"/>
+            <w:u w:val="single"/>
+            <w:rtl w:val="0"/>
+          </w:rPr>
+          <w:t xml:space="preserve">GitHub </w:t>
+        </w:r>
+      </w:hyperlink>
       <w:r>
         <w:rPr>
           <w:sz w:val="19"/>
           <w:szCs w:val="19"/>
           <w:rtl w:val="0"/>
         </w:rPr>
-        <w:t xml:space="preserve"> | </w:t>
-      </w:r>
-      <w:r>
-        <w:rPr>
-          <w:color w:val="1155cc"/>
-          <w:sz w:val="19"/>
-          <w:szCs w:val="19"/>
-          <w:u w:val="single"/>
-          <w:rtl w:val="0"/>
-        </w:rPr>
-        <w:t xml:space="preserve">GitHub </w:t>
-      </w:r>
-      <w:r>
-        <w:rPr>
-          <w:sz w:val="19"/>
-          <w:szCs w:val="19"/>
-          <w:rtl w:val="0"/>
-        </w:rPr>
         <w:t xml:space="preserve">| </w:t>
       </w:r>
-      <w:hyperlink r:id="rId8">
+      <w:hyperlink r:id="rId12">
         <w:r>
           <w:rPr>
             <w:color w:val="1155cc"/>
@@ -1785,19 +1789,4 @@
   </a:objectDefaults>
   <a:extraClrSchemeLst/>
 </a:theme>
-</file>
-
-<file path=customXML/item1.xml><?xml version="1.0" encoding="utf-8"?>
-<go:gDocsCustomXmlDataStorage xmlns:go="http://customooxmlschemas.google.com/" xmlns:r="http://schemas.openxmlformats.org/officeDocument/2006/relationships" uri="GoogleDocsCustomDataVersion2">
-  <go:docsCustomData xmlns:go="http://customooxmlschemas.google.com/" roundtripDataSignature="AMtx7mhe5Z0MsxzVgxPxnCYPqJfhWOVazQ==">CgMxLjA4AHIhMVpNMWNQMmNOY1pheVo4Z3ZtYVdIY3o4b0l6Y1Y5dEJs</go:docsCustomData>
-</go:gDocsCustomXmlDataStorage>
-</file>
-
-<file path=customXML/itemProps1.xml><?xml version="1.0" encoding="utf-8"?>
-<ds:datastoreItem xmlns:ds="http://schemas.openxmlformats.org/officeDocument/2006/customXml" ds:itemID="{11111111-1234-1234-1234-123412341234}">
-  <ds:schemaRefs>
-    <ds:schemaRef ds:uri="http://schemas.openxmlformats.org/officeDocument/2006/relationships"/>
-    <ds:schemaRef ds:uri="http://customooxmlschemas.google.com/"/>
-  </ds:schemaRefs>
-</ds:datastoreItem>
 </file>
</xml_diff>